<commit_message>
BUSI 1764 A1：Word 文档第三版
Co-Authored-By: Claude Opus 5.5 <noreply@anthropic.com>
Claude-Session: https://claude.ai/code/session_015i8AjJvK6nDJDeC9Bah6rX
</commit_message>
<xml_diff>
--- a/content/busi1764/files/A1_Learning_Diary_SELCO.docx
+++ b/content/busi1764/files/A1_Learning_Diary_SELCO.docx
@@ -730,6 +730,12 @@
       </w:hyperlink>
       <w:r>
         <w:rPr>
+          <w:rFonts w:hint="eastAsia"/>
+        </w:rPr>
+        <w:t xml:space="preserve"> </w:t>
+      </w:r>
+      <w:r>
+        <w:rPr>
           <w:rFonts w:ascii="Arial" w:eastAsia="Hiragino Sans GB" w:hAnsi="Arial" w:cs="Arial"/>
           <w:color w:val="1A1D23"/>
           <w:kern w:val="0"/>
@@ -851,6 +857,12 @@
           <w:t>https://case.fuqua.duke.edu/wp-content/uploads/2025/03/Article_Dees_MeaningofSocialEntrepreneurship_2001.pdf</w:t>
         </w:r>
       </w:hyperlink>
+      <w:r>
+        <w:rPr>
+          <w:rFonts w:hint="eastAsia"/>
+        </w:rPr>
+        <w:t xml:space="preserve"> </w:t>
+      </w:r>
       <w:r>
         <w:rPr>
           <w:rFonts w:ascii="Arial" w:eastAsia="Hiragino Sans GB" w:hAnsi="Arial" w:cs="Arial"/>

</xml_diff>